<commit_message>
Add Seed Admin, security guardrails, and CMS map updates.
Restore Streamlit seed admin, teacher rollups, network staff totals, CMS video/expand sidebar, and secret scanning so service_role keys stay local only.
</commit_message>
<xml_diff>
--- a/Questionnaires/ICBC OTM (Questionnaire_Gebeni).docx
+++ b/Questionnaires/ICBC OTM (Questionnaire_Gebeni).docx
@@ -1,6 +1,6 @@
 
 <file path=word/document.xml><?xml version="1.0" encoding="utf-8"?>
-<w:document xmlns:wpc="http://schemas.microsoft.com/office/word/2010/wordprocessingCanvas" xmlns:cx="http://schemas.microsoft.com/office/drawing/2014/chartex" xmlns:cx1="http://schemas.microsoft.com/office/drawing/2015/9/8/chartex" xmlns:cx2="http://schemas.microsoft.com/office/drawing/2015/10/21/chartex" xmlns:cx3="http://schemas.microsoft.com/office/drawing/2016/5/9/chartex" xmlns:cx4="http://schemas.microsoft.com/office/drawing/2016/5/10/chartex" xmlns:cx5="http://schemas.microsoft.com/office/drawing/2016/5/11/chartex" xmlns:cx6="http://schemas.microsoft.com/office/drawing/2016/5/12/chartex" xmlns:cx7="http://schemas.microsoft.com/office/drawing/2016/5/13/chartex" xmlns:cx8="http://schemas.microsoft.com/office/drawing/2016/5/14/chartex" xmlns:mc="http://schemas.openxmlformats.org/markup-compatibility/2006" xmlns:aink="http://schemas.microsoft.com/office/drawing/2016/ink" xmlns:am3d="http://schemas.microsoft.com/office/drawing/2017/model3d" xmlns:o="urn:schemas-microsoft-com:office:office" xmlns:oel="http://schemas.microsoft.com/office/2019/extlst" xmlns:r="http://schemas.openxmlformats.org/officeDocument/2006/relationships" xmlns:m="http://schemas.openxmlformats.org/officeDocument/2006/math" xmlns:v="urn:schemas-microsoft-com:vml" xmlns:wp14="http://schemas.microsoft.com/office/word/2010/wordprocessingDrawing" xmlns:wp="http://schemas.openxmlformats.org/drawingml/2006/wordprocessingDrawing" xmlns:w10="urn:schemas-microsoft-com:office:word" xmlns:w="http://schemas.openxmlformats.org/wordprocessingml/2006/main" xmlns:w14="http://schemas.microsoft.com/office/word/2010/wordml" xmlns:w15="http://schemas.microsoft.com/office/word/2012/wordml" xmlns:w16cex="http://schemas.microsoft.com/office/word/2018/wordml/cex" xmlns:w16cid="http://schemas.microsoft.com/office/word/2016/wordml/cid" xmlns:w16="http://schemas.microsoft.com/office/word/2018/wordml" xmlns:w16sdtdh="http://schemas.microsoft.com/office/word/2020/wordml/sdtdatahash" xmlns:w16se="http://schemas.microsoft.com/office/word/2015/wordml/symex" xmlns:wpg="http://schemas.microsoft.com/office/word/2010/wordprocessingGroup" xmlns:wpi="http://schemas.microsoft.com/office/word/2010/wordprocessingInk" xmlns:wne="http://schemas.microsoft.com/office/word/2006/wordml" xmlns:wps="http://schemas.microsoft.com/office/word/2010/wordprocessingShape" mc:Ignorable="w14 w15 w16se w16cid w16 w16cex w16sdtdh wp14">
+<w:document xmlns:wpc="http://schemas.microsoft.com/office/word/2010/wordprocessingCanvas" xmlns:cx="http://schemas.microsoft.com/office/drawing/2014/chartex" xmlns:cx1="http://schemas.microsoft.com/office/drawing/2015/9/8/chartex" xmlns:cx2="http://schemas.microsoft.com/office/drawing/2015/10/21/chartex" xmlns:cx3="http://schemas.microsoft.com/office/drawing/2016/5/9/chartex" xmlns:cx4="http://schemas.microsoft.com/office/drawing/2016/5/10/chartex" xmlns:cx5="http://schemas.microsoft.com/office/drawing/2016/5/11/chartex" xmlns:cx6="http://schemas.microsoft.com/office/drawing/2016/5/12/chartex" xmlns:cx7="http://schemas.microsoft.com/office/drawing/2016/5/13/chartex" xmlns:cx8="http://schemas.microsoft.com/office/drawing/2016/5/14/chartex" xmlns:mc="http://schemas.openxmlformats.org/markup-compatibility/2006" xmlns:aink="http://schemas.microsoft.com/office/drawing/2016/ink" xmlns:am3d="http://schemas.microsoft.com/office/drawing/2017/model3d" xmlns:o="urn:schemas-microsoft-com:office:office" xmlns:oel="http://schemas.microsoft.com/office/2019/extlst" xmlns:r="http://schemas.openxmlformats.org/officeDocument/2006/relationships" xmlns:m="http://schemas.openxmlformats.org/officeDocument/2006/math" xmlns:v="urn:schemas-microsoft-com:vml" xmlns:wp14="http://schemas.microsoft.com/office/word/2010/wordprocessingDrawing" xmlns:wp="http://schemas.openxmlformats.org/drawingml/2006/wordprocessingDrawing" xmlns:w10="urn:schemas-microsoft-com:office:word" xmlns:w="http://schemas.openxmlformats.org/wordprocessingml/2006/main" xmlns:w14="http://schemas.microsoft.com/office/word/2010/wordml" xmlns:w15="http://schemas.microsoft.com/office/word/2012/wordml" xmlns:w16cex="http://schemas.microsoft.com/office/word/2018/wordml/cex" xmlns:w16cid="http://schemas.microsoft.com/office/word/2016/wordml/cid" xmlns:w16="http://schemas.microsoft.com/office/word/2018/wordml" xmlns:w16du="http://schemas.microsoft.com/office/word/2023/wordml/word16du" xmlns:w16sdtdh="http://schemas.microsoft.com/office/word/2020/wordml/sdtdatahash" xmlns:w16sdtfl="http://schemas.microsoft.com/office/word/2024/wordml/sdtformatlock" xmlns:w16se="http://schemas.microsoft.com/office/word/2015/wordml/symex" xmlns:wpg="http://schemas.microsoft.com/office/word/2010/wordprocessingGroup" xmlns:wpi="http://schemas.microsoft.com/office/word/2010/wordprocessingInk" xmlns:wne="http://schemas.microsoft.com/office/word/2006/wordml" xmlns:wps="http://schemas.microsoft.com/office/word/2010/wordprocessingShape" mc:Ignorable="w14 w15 w16se w16cid w16 w16cex w16sdtdh w16sdtfl w16du wp14">
   <w:body>
     <w:p>
       <w:pPr>
@@ -51,6 +51,16 @@
           <w:szCs w:val="22"/>
         </w:rPr>
         <w:t xml:space="preserve">Pastor: </w:t>
+      </w:r>
+      <w:r>
+        <w:rPr>
+          <w:rFonts w:ascii="Arial" w:hAnsi="Arial" w:cs="Arial"/>
+          <w:b/>
+          <w:bCs/>
+          <w:sz w:val="22"/>
+          <w:szCs w:val="22"/>
+        </w:rPr>
+        <w:t>Dumisani Mdluli</w:t>
       </w:r>
     </w:p>
     <w:p>
@@ -816,6 +826,16 @@
         </w:rPr>
         <w:t>Preschool Teacher or staff member:</w:t>
       </w:r>
+      <w:r>
+        <w:rPr>
+          <w:rFonts w:ascii="Arial" w:hAnsi="Arial" w:cs="Arial"/>
+          <w:b/>
+          <w:bCs/>
+          <w:sz w:val="22"/>
+          <w:szCs w:val="22"/>
+        </w:rPr>
+        <w:t xml:space="preserve"> Gugu Dlamini</w:t>
+      </w:r>
     </w:p>
     <w:p>
       <w:pPr>
@@ -855,7 +875,6 @@
         </w:rPr>
         <w:t xml:space="preserve">What do you enjoy most about serving in your role?   </w:t>
       </w:r>
-      <w:proofErr w:type="gramStart"/>
       <w:r>
         <w:rPr>
           <w:rFonts w:ascii="Arial" w:hAnsi="Arial" w:cs="Arial"/>
@@ -876,18 +895,7 @@
           <w:sz w:val="22"/>
           <w:szCs w:val="22"/>
         </w:rPr>
-        <w:t xml:space="preserve">  Why</w:t>
-      </w:r>
-      <w:proofErr w:type="gramEnd"/>
-      <w:r>
-        <w:rPr>
-          <w:rFonts w:ascii="Arial" w:hAnsi="Arial" w:cs="Arial"/>
-          <w:i/>
-          <w:iCs/>
-          <w:sz w:val="22"/>
-          <w:szCs w:val="22"/>
-        </w:rPr>
-        <w:t xml:space="preserve"> did you become a teacher?</w:t>
+        <w:t xml:space="preserve">  Why did you become a teacher?</w:t>
       </w:r>
     </w:p>
     <w:p>
@@ -1546,6 +1554,26 @@
           <w:szCs w:val="22"/>
         </w:rPr>
         <w:t>Compassionate Care Team member:</w:t>
+      </w:r>
+      <w:r>
+        <w:rPr>
+          <w:rFonts w:ascii="Arial" w:hAnsi="Arial" w:cs="Arial"/>
+          <w:b/>
+          <w:bCs/>
+          <w:sz w:val="22"/>
+          <w:szCs w:val="22"/>
+        </w:rPr>
+        <w:t xml:space="preserve"> </w:t>
+      </w:r>
+      <w:r>
+        <w:rPr>
+          <w:rFonts w:ascii="Arial" w:hAnsi="Arial" w:cs="Arial"/>
+          <w:b/>
+          <w:bCs/>
+          <w:sz w:val="22"/>
+          <w:szCs w:val="22"/>
+        </w:rPr>
+        <w:t>Thoko Dlamini</w:t>
       </w:r>
     </w:p>
     <w:p>
@@ -2035,7 +2063,7 @@
 </file>
 
 <file path=word/numbering.xml><?xml version="1.0" encoding="utf-8"?>
-<w:numbering xmlns:wpc="http://schemas.microsoft.com/office/word/2010/wordprocessingCanvas" xmlns:cx="http://schemas.microsoft.com/office/drawing/2014/chartex" xmlns:cx1="http://schemas.microsoft.com/office/drawing/2015/9/8/chartex" xmlns:cx2="http://schemas.microsoft.com/office/drawing/2015/10/21/chartex" xmlns:cx3="http://schemas.microsoft.com/office/drawing/2016/5/9/chartex" xmlns:cx4="http://schemas.microsoft.com/office/drawing/2016/5/10/chartex" xmlns:cx5="http://schemas.microsoft.com/office/drawing/2016/5/11/chartex" xmlns:cx6="http://schemas.microsoft.com/office/drawing/2016/5/12/chartex" xmlns:cx7="http://schemas.microsoft.com/office/drawing/2016/5/13/chartex" xmlns:cx8="http://schemas.microsoft.com/office/drawing/2016/5/14/chartex" xmlns:mc="http://schemas.openxmlformats.org/markup-compatibility/2006" xmlns:aink="http://schemas.microsoft.com/office/drawing/2016/ink" xmlns:am3d="http://schemas.microsoft.com/office/drawing/2017/model3d" xmlns:o="urn:schemas-microsoft-com:office:office" xmlns:oel="http://schemas.microsoft.com/office/2019/extlst" xmlns:r="http://schemas.openxmlformats.org/officeDocument/2006/relationships" xmlns:m="http://schemas.openxmlformats.org/officeDocument/2006/math" xmlns:v="urn:schemas-microsoft-com:vml" xmlns:wp14="http://schemas.microsoft.com/office/word/2010/wordprocessingDrawing" xmlns:wp="http://schemas.openxmlformats.org/drawingml/2006/wordprocessingDrawing" xmlns:w10="urn:schemas-microsoft-com:office:word" xmlns:w="http://schemas.openxmlformats.org/wordprocessingml/2006/main" xmlns:w14="http://schemas.microsoft.com/office/word/2010/wordml" xmlns:w15="http://schemas.microsoft.com/office/word/2012/wordml" xmlns:w16cex="http://schemas.microsoft.com/office/word/2018/wordml/cex" xmlns:w16cid="http://schemas.microsoft.com/office/word/2016/wordml/cid" xmlns:w16="http://schemas.microsoft.com/office/word/2018/wordml" xmlns:w16sdtdh="http://schemas.microsoft.com/office/word/2020/wordml/sdtdatahash" xmlns:w16se="http://schemas.microsoft.com/office/word/2015/wordml/symex" xmlns:wpg="http://schemas.microsoft.com/office/word/2010/wordprocessingGroup" xmlns:wpi="http://schemas.microsoft.com/office/word/2010/wordprocessingInk" xmlns:wne="http://schemas.microsoft.com/office/word/2006/wordml" xmlns:wps="http://schemas.microsoft.com/office/word/2010/wordprocessingShape" mc:Ignorable="w14 w15 w16se w16cid w16 w16cex w16sdtdh wp14">
+<w:numbering xmlns:wpc="http://schemas.microsoft.com/office/word/2010/wordprocessingCanvas" xmlns:cx="http://schemas.microsoft.com/office/drawing/2014/chartex" xmlns:cx1="http://schemas.microsoft.com/office/drawing/2015/9/8/chartex" xmlns:cx2="http://schemas.microsoft.com/office/drawing/2015/10/21/chartex" xmlns:cx3="http://schemas.microsoft.com/office/drawing/2016/5/9/chartex" xmlns:cx4="http://schemas.microsoft.com/office/drawing/2016/5/10/chartex" xmlns:cx5="http://schemas.microsoft.com/office/drawing/2016/5/11/chartex" xmlns:cx6="http://schemas.microsoft.com/office/drawing/2016/5/12/chartex" xmlns:cx7="http://schemas.microsoft.com/office/drawing/2016/5/13/chartex" xmlns:cx8="http://schemas.microsoft.com/office/drawing/2016/5/14/chartex" xmlns:mc="http://schemas.openxmlformats.org/markup-compatibility/2006" xmlns:aink="http://schemas.microsoft.com/office/drawing/2016/ink" xmlns:am3d="http://schemas.microsoft.com/office/drawing/2017/model3d" xmlns:o="urn:schemas-microsoft-com:office:office" xmlns:oel="http://schemas.microsoft.com/office/2019/extlst" xmlns:r="http://schemas.openxmlformats.org/officeDocument/2006/relationships" xmlns:m="http://schemas.openxmlformats.org/officeDocument/2006/math" xmlns:v="urn:schemas-microsoft-com:vml" xmlns:wp14="http://schemas.microsoft.com/office/word/2010/wordprocessingDrawing" xmlns:wp="http://schemas.openxmlformats.org/drawingml/2006/wordprocessingDrawing" xmlns:w10="urn:schemas-microsoft-com:office:word" xmlns:w="http://schemas.openxmlformats.org/wordprocessingml/2006/main" xmlns:w14="http://schemas.microsoft.com/office/word/2010/wordml" xmlns:w15="http://schemas.microsoft.com/office/word/2012/wordml" xmlns:w16cex="http://schemas.microsoft.com/office/word/2018/wordml/cex" xmlns:w16cid="http://schemas.microsoft.com/office/word/2016/wordml/cid" xmlns:w16="http://schemas.microsoft.com/office/word/2018/wordml" xmlns:w16du="http://schemas.microsoft.com/office/word/2023/wordml/word16du" xmlns:w16sdtdh="http://schemas.microsoft.com/office/word/2020/wordml/sdtdatahash" xmlns:w16sdtfl="http://schemas.microsoft.com/office/word/2024/wordml/sdtformatlock" xmlns:w16se="http://schemas.microsoft.com/office/word/2015/wordml/symex" xmlns:wpg="http://schemas.microsoft.com/office/word/2010/wordprocessingGroup" xmlns:wpi="http://schemas.microsoft.com/office/word/2010/wordprocessingInk" xmlns:wne="http://schemas.microsoft.com/office/word/2006/wordml" xmlns:wps="http://schemas.microsoft.com/office/word/2010/wordprocessingShape" mc:Ignorable="w14 w15 w16se w16cid w16 w16cex w16sdtdh w16sdtfl w16du wp14">
   <w:abstractNum w:abstractNumId="0" w15:restartNumberingAfterBreak="0">
     <w:nsid w:val="01E1375F"/>
     <w:multiLevelType w:val="hybridMultilevel"/>
@@ -3430,7 +3458,7 @@
 </file>
 
 <file path=word/styles.xml><?xml version="1.0" encoding="utf-8"?>
-<w:styles xmlns:mc="http://schemas.openxmlformats.org/markup-compatibility/2006" xmlns:r="http://schemas.openxmlformats.org/officeDocument/2006/relationships" xmlns:w="http://schemas.openxmlformats.org/wordprocessingml/2006/main" xmlns:w14="http://schemas.microsoft.com/office/word/2010/wordml" xmlns:w15="http://schemas.microsoft.com/office/word/2012/wordml" xmlns:w16cex="http://schemas.microsoft.com/office/word/2018/wordml/cex" xmlns:w16cid="http://schemas.microsoft.com/office/word/2016/wordml/cid" xmlns:w16="http://schemas.microsoft.com/office/word/2018/wordml" xmlns:w16sdtdh="http://schemas.microsoft.com/office/word/2020/wordml/sdtdatahash" xmlns:w16se="http://schemas.microsoft.com/office/word/2015/wordml/symex" mc:Ignorable="w14 w15 w16se w16cid w16 w16cex w16sdtdh">
+<w:styles xmlns:mc="http://schemas.openxmlformats.org/markup-compatibility/2006" xmlns:r="http://schemas.openxmlformats.org/officeDocument/2006/relationships" xmlns:w="http://schemas.openxmlformats.org/wordprocessingml/2006/main" xmlns:w14="http://schemas.microsoft.com/office/word/2010/wordml" xmlns:w15="http://schemas.microsoft.com/office/word/2012/wordml" xmlns:w16cex="http://schemas.microsoft.com/office/word/2018/wordml/cex" xmlns:w16cid="http://schemas.microsoft.com/office/word/2016/wordml/cid" xmlns:w16="http://schemas.microsoft.com/office/word/2018/wordml" xmlns:w16du="http://schemas.microsoft.com/office/word/2023/wordml/word16du" xmlns:w16sdtdh="http://schemas.microsoft.com/office/word/2020/wordml/sdtdatahash" xmlns:w16sdtfl="http://schemas.microsoft.com/office/word/2024/wordml/sdtformatlock" xmlns:w16se="http://schemas.microsoft.com/office/word/2015/wordml/symex" mc:Ignorable="w14 w15 w16se w16cid w16 w16cex w16sdtdh w16sdtfl w16du">
   <w:docDefaults>
     <w:rPrDefault>
       <w:rPr>
@@ -4141,6 +4169,26 @@
 </file>
 
 <file path=customXml/item1.xml><?xml version="1.0" encoding="utf-8"?>
+<p:properties xmlns:p="http://schemas.microsoft.com/office/2006/metadata/properties" xmlns:xsi="http://www.w3.org/2001/XMLSchema-instance" xmlns:pc="http://schemas.microsoft.com/office/infopath/2007/PartnerControls">
+  <documentManagement>
+    <TaxCatchAll xmlns="34d000cf-cc1a-4d78-b409-980d9e31e4f4" xsi:nil="true"/>
+    <lcf76f155ced4ddcb4097134ff3c332f xmlns="d605fb9e-3197-4618-aab7-16a3ee0e6913">
+      <Terms xmlns="http://schemas.microsoft.com/office/infopath/2007/PartnerControls"/>
+    </lcf76f155ced4ddcb4097134ff3c332f>
+  </documentManagement>
+</p:properties>
+</file>
+
+<file path=customXml/item2.xml><?xml version="1.0" encoding="utf-8"?>
+<?mso-contentType ?>
+<FormTemplates xmlns="http://schemas.microsoft.com/sharepoint/v3/contenttype/forms">
+  <Display>DocumentLibraryForm</Display>
+  <Edit>DocumentLibraryForm</Edit>
+  <New>DocumentLibraryForm</New>
+</FormTemplates>
+</file>
+
+<file path=customXml/item3.xml><?xml version="1.0" encoding="utf-8"?>
 <ct:contentTypeSchema xmlns:ct="http://schemas.microsoft.com/office/2006/metadata/contentType" xmlns:ma="http://schemas.microsoft.com/office/2006/metadata/properties/metaAttributes" ct:_="" ma:_="" ma:contentTypeName="Document" ma:contentTypeID="0x010100CC5C2E639A21C543BDA0CC39BBCEE23F" ma:contentTypeVersion="12" ma:contentTypeDescription="Create a new document." ma:contentTypeScope="" ma:versionID="6430d2c5c82f2bdb494be44ddf918b3a">
   <xsd:schema xmlns:xsd="http://www.w3.org/2001/XMLSchema" xmlns:xs="http://www.w3.org/2001/XMLSchema" xmlns:p="http://schemas.microsoft.com/office/2006/metadata/properties" xmlns:ns2="d605fb9e-3197-4618-aab7-16a3ee0e6913" xmlns:ns3="34d000cf-cc1a-4d78-b409-980d9e31e4f4" targetNamespace="http://schemas.microsoft.com/office/2006/metadata/properties" ma:root="true" ma:fieldsID="30701851025ca8c366bcaeb2acad5231" ns2:_="" ns3:_="">
     <xsd:import namespace="d605fb9e-3197-4618-aab7-16a3ee0e6913"/>
@@ -4341,34 +4389,40 @@
 </ct:contentTypeSchema>
 </file>
 
-<file path=customXml/item2.xml><?xml version="1.0" encoding="utf-8"?>
-<?mso-contentType ?>
-<FormTemplates xmlns="http://schemas.microsoft.com/sharepoint/v3/contenttype/forms">
-  <Display>DocumentLibraryForm</Display>
-  <Edit>DocumentLibraryForm</Edit>
-  <New>DocumentLibraryForm</New>
-</FormTemplates>
-</file>
-
-<file path=customXml/item3.xml><?xml version="1.0" encoding="utf-8"?>
-<p:properties xmlns:p="http://schemas.microsoft.com/office/2006/metadata/properties" xmlns:xsi="http://www.w3.org/2001/XMLSchema-instance" xmlns:pc="http://schemas.microsoft.com/office/infopath/2007/PartnerControls">
-  <documentManagement>
-    <TaxCatchAll xmlns="34d000cf-cc1a-4d78-b409-980d9e31e4f4" xsi:nil="true"/>
-    <lcf76f155ced4ddcb4097134ff3c332f xmlns="d605fb9e-3197-4618-aab7-16a3ee0e6913">
-      <Terms xmlns="http://schemas.microsoft.com/office/infopath/2007/PartnerControls"/>
-    </lcf76f155ced4ddcb4097134ff3c332f>
-  </documentManagement>
-</p:properties>
-</file>
-
 <file path=customXml/itemProps1.xml><?xml version="1.0" encoding="utf-8"?>
-<ds:datastoreItem xmlns:ds="http://schemas.openxmlformats.org/officeDocument/2006/customXml" ds:itemID="{5A495333-2960-467C-B11B-3DBAFAE8AACB}"/>
+<ds:datastoreItem xmlns:ds="http://schemas.openxmlformats.org/officeDocument/2006/customXml" ds:itemID="{6321AC2D-386A-4302-9D30-7804C7DC0F24}">
+  <ds:schemaRefs>
+    <ds:schemaRef ds:uri="http://schemas.microsoft.com/office/2006/metadata/properties"/>
+    <ds:schemaRef ds:uri="http://schemas.microsoft.com/office/infopath/2007/PartnerControls"/>
+    <ds:schemaRef ds:uri="34d000cf-cc1a-4d78-b409-980d9e31e4f4"/>
+    <ds:schemaRef ds:uri="d605fb9e-3197-4618-aab7-16a3ee0e6913"/>
+  </ds:schemaRefs>
+</ds:datastoreItem>
 </file>
 
 <file path=customXml/itemProps2.xml><?xml version="1.0" encoding="utf-8"?>
-<ds:datastoreItem xmlns:ds="http://schemas.openxmlformats.org/officeDocument/2006/customXml" ds:itemID="{CE2ACEAA-5889-4504-A371-9F5CA91A67BA}"/>
+<ds:datastoreItem xmlns:ds="http://schemas.openxmlformats.org/officeDocument/2006/customXml" ds:itemID="{CE2ACEAA-5889-4504-A371-9F5CA91A67BA}">
+  <ds:schemaRefs>
+    <ds:schemaRef ds:uri="http://schemas.microsoft.com/sharepoint/v3/contenttype/forms"/>
+  </ds:schemaRefs>
+</ds:datastoreItem>
 </file>
 
 <file path=customXml/itemProps3.xml><?xml version="1.0" encoding="utf-8"?>
-<ds:datastoreItem xmlns:ds="http://schemas.openxmlformats.org/officeDocument/2006/customXml" ds:itemID="{6321AC2D-386A-4302-9D30-7804C7DC0F24}"/>
+<ds:datastoreItem xmlns:ds="http://schemas.openxmlformats.org/officeDocument/2006/customXml" ds:itemID="{5A495333-2960-467C-B11B-3DBAFAE8AACB}">
+  <ds:schemaRefs>
+    <ds:schemaRef ds:uri="http://schemas.microsoft.com/office/2006/metadata/contentType"/>
+    <ds:schemaRef ds:uri="http://schemas.microsoft.com/office/2006/metadata/properties/metaAttributes"/>
+    <ds:schemaRef ds:uri="http://www.w3.org/2001/XMLSchema"/>
+    <ds:schemaRef ds:uri="http://schemas.microsoft.com/office/2006/metadata/properties"/>
+    <ds:schemaRef ds:uri="d605fb9e-3197-4618-aab7-16a3ee0e6913"/>
+    <ds:schemaRef ds:uri="34d000cf-cc1a-4d78-b409-980d9e31e4f4"/>
+    <ds:schemaRef ds:uri="http://schemas.microsoft.com/office/2006/documentManagement/types"/>
+    <ds:schemaRef ds:uri="http://schemas.microsoft.com/office/infopath/2007/PartnerControls"/>
+    <ds:schemaRef ds:uri="http://schemas.openxmlformats.org/package/2006/metadata/core-properties"/>
+    <ds:schemaRef ds:uri="http://purl.org/dc/elements/1.1/"/>
+    <ds:schemaRef ds:uri="http://purl.org/dc/terms/"/>
+    <ds:schemaRef ds:uri="http://schemas.microsoft.com/internal/obd"/>
+  </ds:schemaRefs>
+</ds:datastoreItem>
 </file>
</xml_diff>